<commit_message>
Sync resume across md, html, docx. Fix summary, SafetyCulture, Beam, Hilton, property count
Co-Authored-By: Claude Opus 4.6 (1M context) <noreply@anthropic.com>
</commit_message>
<xml_diff>
--- a/Kelly_Vohs_Resume.docx
+++ b/Kelly_Vohs_Resume.docx
@@ -96,7 +96,7 @@
           <w:bCs/>
           <w:color w:val="333333"/>
         </w:rPr>
-        <w:t>350 properties</w:t>
+        <w:t>over 500 properties</w:t>
       </w:r>
       <w:r>
         <w:rPr>
@@ -246,7 +246,7 @@
           <w:rFonts w:ascii="EB Garamond" w:eastAsia="EB Garamond" w:hAnsi="EB Garamond" w:cs="EB Garamond"/>
           <w:color w:val="555555"/>
         </w:rPr>
-        <w:t xml:space="preserve">Global SaaS platform for frontline operations - 25,000 customers in 180+ countries, including IKEA, Royal Caribbean, Toyota, and SpaceX. Hired as President to lead go-to-market and customer strategy from the U.S. The founder stepped down two months before my start; I took over as CEO. Inherited an 800-person team spread across Sydney, Manila, Manchester, Amsterdam, and Kansas City, with 500 in Sydney. Reset the culture around truth and accountability. Built an executive team - attracted senior leaders from Google, Twitter, Okta, and Microsoft to Sydney. Got the company focused on the problem it </w:t>
+        <w:t xml:space="preserve">Global SaaS platform for frontline operations - 25,000 customers in 180+ countries, including IKEA, Royal Caribbean, Toyota, and SpaceX. Hired as President to lead go-to-market and customer strategy from the U.S. The founder stepped down two months before my start; I took over as CEO. Inherited a platform that needed a full rebuild and a team spread across Sydney, Manila, Manchester, Amsterdam, and Kansas City. Rebuilt the executive team - attracted senior leaders from Google, Twitter, Okta, and Microsoft to Sydney. Reset the product roadmap and go-to-market motion and grew </w:t>
       </w:r>
       <w:proofErr w:type="gramStart"/>
       <w:r>
@@ -254,7 +254,6 @@
           <w:rFonts w:ascii="EB Garamond" w:eastAsia="EB Garamond" w:hAnsi="EB Garamond" w:cs="EB Garamond"/>
           <w:color w:val="555555"/>
         </w:rPr>
-        <w:t>actually solves</w:t>
       </w:r>
       <w:proofErr w:type="gramEnd"/>
       <w:r>
@@ -262,7 +261,6 @@
           <w:rFonts w:ascii="EB Garamond" w:eastAsia="EB Garamond" w:hAnsi="EB Garamond" w:cs="EB Garamond"/>
           <w:color w:val="555555"/>
         </w:rPr>
-        <w:t xml:space="preserve"> and back to thinking customer first. Pulled engineers off production to build AI prototypes and shipped them. Grew </w:t>
       </w:r>
       <w:r>
         <w:rPr>
@@ -278,7 +276,7 @@
           <w:rFonts w:ascii="EB Garamond" w:eastAsia="EB Garamond" w:hAnsi="EB Garamond" w:cs="EB Garamond"/>
           <w:color w:val="555555"/>
         </w:rPr>
-        <w:t>. I flew to Sydney every month, but it became clear to me the team needed a CEO in Sydney, not New York. Hard decision, but the right one.</w:t>
+        <w:t>. Stepped away when the role required permanent relocation to Sydney - family comes first, a lesson the army taught me a long time ago.</w:t>
       </w:r>
     </w:p>
     <w:p>
@@ -342,7 +340,7 @@
           <w:bCs/>
           <w:color w:val="555555"/>
         </w:rPr>
-        <w:t>263 assets and 74K units to a peak of 532 assets and 173K units</w:t>
+        <w:t>263 assets and 74K units to a peak of 536 assets and 173K units</w:t>
       </w:r>
       <w:r>
         <w:rPr>
@@ -492,7 +490,7 @@
           <w:rFonts w:ascii="EB Garamond" w:eastAsia="EB Garamond" w:hAnsi="EB Garamond" w:cs="EB Garamond"/>
           <w:color w:val="555555"/>
         </w:rPr>
-        <w:t xml:space="preserve">StuyTown - the largest rental community in the country. 11,241 apartments. A city within a city. Transformed it into Beam Living and grew the platform to 15,000 apartments across New York with </w:t>
+        <w:t xml:space="preserve">StuyTown - the largest rental community in the country. 11,241 apartments. A city within a city. Transformed it into Beam Living and grew the platform to 15,000 apartments across New York. </w:t>
       </w:r>
       <w:r>
         <w:rPr>
@@ -517,36 +515,27 @@
           <w:bCs/>
           <w:color w:val="555555"/>
         </w:rPr>
-        <w:t>$300M invested in capital improvements</w:t>
-      </w:r>
-      <w:r>
-        <w:rPr>
-          <w:rFonts w:ascii="EB Garamond" w:eastAsia="EB Garamond" w:hAnsi="EB Garamond" w:cs="EB Garamond"/>
-          <w:color w:val="555555"/>
-        </w:rPr>
-        <w:t xml:space="preserve">. Expense growth </w:t>
-      </w:r>
-      <w:r>
-        <w:rPr>
-          <w:rFonts w:ascii="EB Garamond" w:eastAsia="EB Garamond" w:hAnsi="EB Garamond" w:cs="EB Garamond"/>
-          <w:b/>
-          <w:bCs/>
-          <w:color w:val="555555"/>
-        </w:rPr>
-        <w:t>CAGR of just over 2%</w:t>
-      </w:r>
-      <w:r>
-        <w:rPr>
-          <w:rFonts w:ascii="EB Garamond" w:eastAsia="EB Garamond" w:hAnsi="EB Garamond" w:cs="EB Garamond"/>
-          <w:color w:val="555555"/>
-        </w:rPr>
-        <w:t xml:space="preserve"> across six years. Took work order completion from </w:t>
-      </w:r>
-      <w:r>
-        <w:rPr>
-          <w:rFonts w:ascii="EB Garamond" w:eastAsia="EB Garamond" w:hAnsi="EB Garamond" w:cs="EB Garamond"/>
-          <w:b/>
-          <w:bCs/>
+        <w:t>$700M invested in capital projects</w:t>
+      </w:r>
+      <w:r>
+        <w:rPr>
+          <w:rFonts w:ascii="EB Garamond" w:eastAsia="EB Garamond" w:hAnsi="EB Garamond" w:cs="EB Garamond"/>
+          <w:color w:val="555555"/>
+        </w:rPr>
+        <w:t xml:space="preserve"> across the portfolio. Achieved LEED Platinum certification at StuyTown and installed 9,671 rooftop solar panels - the largest private multi-family solar array in the United States. Took work order completion from </w:t>
+      </w:r>
+      <w:r>
+        <w:rPr>
+          <w:rFonts w:ascii="EB Garamond" w:eastAsia="EB Garamond" w:hAnsi="EB Garamond" w:cs="EB Garamond"/>
+          <w:b/>
+          <w:bCs/>
+          <w:color w:val="555555"/>
+        </w:rPr>
+      </w:r>
+      <w:r>
+        <w:rPr>
+          <w:rFonts w:ascii="EB Garamond" w:eastAsia="EB Garamond" w:hAnsi="EB Garamond" w:cs="EB Garamond"/>
+          <w:b/>
           <w:color w:val="555555"/>
         </w:rPr>
         <w:t>three weeks to an average of five days</w:t>
@@ -554,25 +543,32 @@
       <w:r>
         <w:rPr>
           <w:rFonts w:ascii="EB Garamond" w:eastAsia="EB Garamond" w:hAnsi="EB Garamond" w:cs="EB Garamond"/>
-          <w:color w:val="555555"/>
-        </w:rPr>
-        <w:t xml:space="preserve">. </w:t>
-      </w:r>
-      <w:r>
-        <w:rPr>
-          <w:rFonts w:ascii="EB Garamond" w:eastAsia="EB Garamond" w:hAnsi="EB Garamond" w:cs="EB Garamond"/>
-          <w:b/>
-          <w:bCs/>
-          <w:color w:val="555555"/>
-        </w:rPr>
-        <w:t>NPS up over 200%</w:t>
-      </w:r>
-      <w:r>
-        <w:rPr>
-          <w:rFonts w:ascii="EB Garamond" w:eastAsia="EB Garamond" w:hAnsi="EB Garamond" w:cs="EB Garamond"/>
-          <w:color w:val="555555"/>
-        </w:rPr>
-        <w:t xml:space="preserve">. Reshaped 120,000 sq ft of retail - rents from </w:t>
+          <w:bCs/>
+          <w:color w:val="555555"/>
+        </w:rPr>
+        <w:t xml:space="preserve"> - a 64% reduction - and drove </w:t>
+      </w:r>
+      <w:r>
+        <w:rPr>
+          <w:rFonts w:ascii="EB Garamond" w:eastAsia="EB Garamond" w:hAnsi="EB Garamond" w:cs="EB Garamond"/>
+          <w:color w:val="555555"/>
+        </w:rPr>
+      </w:r>
+      <w:r>
+        <w:rPr>
+          <w:rFonts w:ascii="EB Garamond" w:eastAsia="EB Garamond" w:hAnsi="EB Garamond" w:cs="EB Garamond"/>
+          <w:b/>
+          <w:bCs/>
+          <w:color w:val="555555"/>
+        </w:rPr>
+        <w:t>NPS up 200%</w:t>
+      </w:r>
+      <w:r>
+        <w:rPr>
+          <w:rFonts w:ascii="EB Garamond" w:eastAsia="EB Garamond" w:hAnsi="EB Garamond" w:cs="EB Garamond"/>
+          <w:color w:val="555555"/>
+        </w:rPr>
+        <w:t xml:space="preserve">. Renovated 1,750+ units, generating $25M in additional annual revenue. Reshaped 120,000 sq ft of retail - rents from </w:t>
       </w:r>
       <w:r>
         <w:rPr>
@@ -588,7 +584,7 @@
           <w:rFonts w:ascii="EB Garamond" w:eastAsia="EB Garamond" w:hAnsi="EB Garamond" w:cs="EB Garamond"/>
           <w:color w:val="555555"/>
         </w:rPr>
-        <w:t xml:space="preserve">, anchored by Whole Foods and new restaurant concepts that transformed the community and drove residential demand. During COVID, built a community pantry, raised money, and delivered over </w:t>
+        <w:t xml:space="preserve">, anchored by Whole Foods and new restaurant concepts that reshaped the community and drove residential demand. Expense growth CAGR of just over 2% against CPI of 3.2%. During COVID, built a community pantry, raised money, and delivered over </w:t>
       </w:r>
       <w:r>
         <w:rPr>

</xml_diff>

<commit_message>
Kill dashes, graduated salutatorian, fix personal section font size
Co-Authored-By: Claude Opus 4.6 (1M context) <noreply@anthropic.com>
</commit_message>
<xml_diff>
--- a/Kelly_Vohs_Resume.docx
+++ b/Kelly_Vohs_Resume.docx
@@ -522,7 +522,7 @@
           <w:rFonts w:ascii="EB Garamond" w:eastAsia="EB Garamond" w:hAnsi="EB Garamond" w:cs="EB Garamond"/>
           <w:color w:val="555555"/>
         </w:rPr>
-        <w:t xml:space="preserve"> across the portfolio. Achieved LEED Platinum certification at StuyTown and installed 9,671 rooftop solar panels - the largest private multi-family solar array in the United States. Took work order completion from </w:t>
+        <w:t xml:space="preserve"> across the portfolio. Achieved LEED Platinum certification at StuyTown and installed 9,671 rooftop solar panels , the largest private multi-family solar array in the United States. Took work order completion from </w:t>
       </w:r>
       <w:r>
         <w:rPr>
@@ -743,7 +743,7 @@
           <w:rFonts w:ascii="EB Garamond" w:eastAsia="EB Garamond" w:hAnsi="EB Garamond" w:cs="EB Garamond"/>
           <w:color w:val="555555"/>
         </w:rPr>
-        <w:t xml:space="preserve"> (BTTY), was born - 39 days in, staring at 67 projects on a whiteboard, and deciding to get 1% better every day and let it compound. Relocated to Chicago to build and open the Conrad - adaptive reuse, first employee, $140M project, grew the team from </w:t>
+        <w:t xml:space="preserve"> (BTTY), was born. 39 days in, staring at 67 projects on a whiteboard, and deciding to get 1% better every day and let it compound. Relocated to Chicago to build and open the Conrad - adaptive reuse, first employee, $140M project, grew the team from </w:t>
       </w:r>
       <w:r>
         <w:rPr>
@@ -1010,7 +1010,7 @@
           <w:rFonts w:ascii="EB Garamond" w:eastAsia="EB Garamond" w:hAnsi="EB Garamond" w:cs="EB Garamond"/>
           <w:color w:val="555555"/>
         </w:rPr>
-        <w:t xml:space="preserve">Walked in as a server at 18. Earned a degree in accounting while working full-time, finishing second in class. The leaders there taught me it’s about team. That’s where </w:t>
+        <w:t xml:space="preserve">Walked in as a server at 18. Earned a degree in accounting while working full-time, graduated salutatorian. The leaders there taught me it’s about team. That’s where </w:t>
       </w:r>
       <w:r>
         <w:rPr>

</xml_diff>

<commit_message>
Kill dashes, fix grammar, sync SafetyCulture across all files, graduated as salutatorian
Co-Authored-By: Claude Opus 4.6 (1M context) <noreply@anthropic.com>
</commit_message>
<xml_diff>
--- a/Kelly_Vohs_Resume.docx
+++ b/Kelly_Vohs_Resume.docx
@@ -246,7 +246,7 @@
           <w:rFonts w:ascii="EB Garamond" w:eastAsia="EB Garamond" w:hAnsi="EB Garamond" w:cs="EB Garamond"/>
           <w:color w:val="555555"/>
         </w:rPr>
-        <w:t xml:space="preserve">Global SaaS platform for frontline operations - 25,000 customers in 180+ countries, including IKEA, Royal Caribbean, Toyota, and SpaceX. Hired as President to lead go-to-market and customer strategy from the U.S. The founder stepped down two months before my start; I took over as CEO. Inherited a platform that needed a full rebuild and a team spread across Sydney, Manila, Manchester, Amsterdam, and Kansas City. Rebuilt the executive team - attracted senior leaders from Google, Twitter, Okta, and Microsoft to Sydney. Reset the product roadmap and go-to-market motion and grew </w:t>
+        <w:t xml:space="preserve">Global SaaS platform for frontline operations. 25,000 customers in 180+ countries, including IKEA, Royal Caribbean, Toyota, and SpaceX. Hired as President to lead go-to-market and customer strategy from the U.S. The founder stepped down two months before my start; I took over as CEO. Inherited a platform that needed a full rebuild and a team spread across Sydney, Manila, Manchester, Amsterdam, and Kansas City. Rebuilt the executive team. Attracted senior leaders from Google, Twitter, Okta, and Microsoft to Sydney. Reset the product roadmap and go-to-market motion, growing </w:t>
       </w:r>
       <w:proofErr w:type="gramStart"/>
       <w:r>
@@ -276,7 +276,7 @@
           <w:rFonts w:ascii="EB Garamond" w:eastAsia="EB Garamond" w:hAnsi="EB Garamond" w:cs="EB Garamond"/>
           <w:color w:val="555555"/>
         </w:rPr>
-        <w:t>. Stepped away when the role required permanent relocation to Sydney - family comes first, a lesson the army taught me a long time ago.</w:t>
+        <w:t>. Stepped away when the role required permanent relocation to Sydney. Family comes first, a lesson the army taught me a long time ago.</w:t>
       </w:r>
     </w:p>
     <w:p>
@@ -679,7 +679,7 @@
           <w:rFonts w:ascii="EB Garamond" w:eastAsia="EB Garamond" w:hAnsi="EB Garamond" w:cs="EB Garamond"/>
           <w:color w:val="555555"/>
         </w:rPr>
-        <w:t xml:space="preserve">Boca Raton Resort &amp; Club: two hotels, 1,047 rooms, two golf courses, 14 restaurants, 150,000 sq ft of meeting space, and a 3,200-family membership program. Changed the culture of an 1,800-person organization - </w:t>
+        <w:t xml:space="preserve">Boca Raton Resort &amp; Club: two hotels, 1,047 rooms, two golf courses, 14 restaurants, 150,000 sq ft of meeting space, and a 3,200-family membership program. Changed the culture of an 1,800-person organization. </w:t>
       </w:r>
       <w:r>
         <w:rPr>
@@ -743,7 +743,7 @@
           <w:rFonts w:ascii="EB Garamond" w:eastAsia="EB Garamond" w:hAnsi="EB Garamond" w:cs="EB Garamond"/>
           <w:color w:val="555555"/>
         </w:rPr>
-        <w:t xml:space="preserve"> (BTTY), was born. 39 days in, staring at 67 projects on a whiteboard, and deciding to get 1% better every day and let it compound. Relocated to Chicago to build and open the Conrad - adaptive reuse, first employee, $140M project, grew the team from </w:t>
+        <w:t xml:space="preserve"> (BTTY), was born. 39 days in, staring at 67 projects on a whiteboard, I decided to get 1% better every day and let it compound. Relocated to Chicago to build and open the Conrad. Adaptive reuse, first employee, $140M project, grew the team from </w:t>
       </w:r>
       <w:r>
         <w:rPr>
@@ -822,7 +822,7 @@
           <w:rFonts w:ascii="EB Garamond" w:eastAsia="EB Garamond" w:hAnsi="EB Garamond" w:cs="EB Garamond"/>
           <w:color w:val="555555"/>
         </w:rPr>
-        <w:t xml:space="preserve">Starwood portfolio company. 22 restaurants across six brands and 3,000 employees in New York City. First role after eight years in the army. Built the people process from scratch - analytical hiring, 30/60/90 reviews, performance management. </w:t>
+        <w:t xml:space="preserve">Starwood portfolio company. 22 restaurants across six brands and 3,000 employees in New York City. First role after eight years in the army. Built the people process from scratch. analytical hiring, 30/60/90 reviews, performance management. </w:t>
       </w:r>
       <w:r>
         <w:rPr>
@@ -932,7 +932,7 @@
           <w:rFonts w:ascii="EB Garamond" w:eastAsia="EB Garamond" w:hAnsi="EB Garamond" w:cs="EB Garamond"/>
           <w:color w:val="555555"/>
         </w:rPr>
-        <w:t xml:space="preserve">. Led humanitarian relief operations in Tajikistan - landed U.S. aircraft on a remote airfield 48 hours after meeting with the Deputy Prime Minister, </w:t>
+        <w:t xml:space="preserve">. Led humanitarian relief operations in Tajikistan. landed U.S. aircraft on a remote airfield 48 hours after meeting with the Deputy Prime Minister, </w:t>
       </w:r>
       <w:proofErr w:type="gramStart"/>
       <w:r>
@@ -940,7 +940,7 @@
           <w:rFonts w:ascii="EB Garamond" w:eastAsia="EB Garamond" w:hAnsi="EB Garamond" w:cs="EB Garamond"/>
           <w:color w:val="555555"/>
         </w:rPr>
-        <w:t>provided assistance to</w:t>
+        <w:t>assisted</w:t>
       </w:r>
       <w:proofErr w:type="gramEnd"/>
       <w:r>
@@ -1010,7 +1010,7 @@
           <w:rFonts w:ascii="EB Garamond" w:eastAsia="EB Garamond" w:hAnsi="EB Garamond" w:cs="EB Garamond"/>
           <w:color w:val="555555"/>
         </w:rPr>
-        <w:t xml:space="preserve">Walked in as a server at 18. Earned a degree in accounting while working full-time, graduated salutatorian. The leaders there taught me it’s about team. That’s where </w:t>
+        <w:t xml:space="preserve">Walked in as a server at 18. Earned a degree in accounting while working full-time, graduated as salutatorian. The leaders there taught me it’s about team. That’s where </w:t>
       </w:r>
       <w:r>
         <w:rPr>
@@ -1228,7 +1228,7 @@
           <w:rFonts w:ascii="EB Garamond" w:eastAsia="EB Garamond" w:hAnsi="EB Garamond" w:cs="EB Garamond"/>
           <w:color w:val="555555"/>
         </w:rPr>
-        <w:t>Married to Brandi. Three sons - 21, 19, 15. Based in New York City. I run, take photos, build software, and write about trying to get better. Brandi is my adventure partner. And that’s what we do. Boys, three dogs, a tortoise, and a cat in tow.</w:t>
+        <w:t>Married to Brandi. Three sons. 21, 19, 15. Based in New York City. I run, take photos, build software, and write about trying to get better. Brandi is my adventure partner. And that’s what we do. Boys, three dogs, a tortoise, and a cat in tow.</w:t>
       </w:r>
     </w:p>
     <w:p/>

</xml_diff>

<commit_message>
Fix docx: add REX to Beam, unbold texting line in Hilton
Co-Authored-By: Claude Opus 4.6 (1M context) <noreply@anthropic.com>
</commit_message>
<xml_diff>
--- a/Kelly_Vohs_Resume.docx
+++ b/Kelly_Vohs_Resume.docx
@@ -568,7 +568,7 @@
           <w:rFonts w:ascii="EB Garamond" w:eastAsia="EB Garamond" w:hAnsi="EB Garamond" w:cs="EB Garamond"/>
           <w:color w:val="555555"/>
         </w:rPr>
-        <w:t xml:space="preserve">. Renovated 1,750+ units, generating $25M in additional annual revenue. Reshaped 120,000 sq ft of retail - rents from </w:t>
+        <w:t xml:space="preserve">. Built REX, a custom above-property CRM that centralized the resident experience across 15,000 apartments.. Renovated 1,750+ units, generating $25M in additional annual revenue. Reshaped 120,000 sq ft of retail - rents from </w:t>
       </w:r>
       <w:r>
         <w:rPr>
@@ -720,7 +720,16 @@
           <w:bCs/>
           <w:color w:val="555555"/>
         </w:rPr>
-        <w:t>Increased EBITDA $30M in 36 months. Introduced guest texting to Hilton at Boca Raton, the first property to pilot what became a brand-wide platform</w:t>
+        <w:t>Increased EBITDA $30M in 36 months</w:t>
+      </w:r>
+      <w:r>
+        <w:rPr>
+          <w:rFonts w:ascii="EB Garamond" w:eastAsia="EB Garamond" w:hAnsi="EB Garamond" w:cs="EB Garamond"/>
+          <w:b w:val="0"/>
+          <w:bCs/>
+          <w:color w:val="555555"/>
+        </w:rPr>
+        <w:t>. Introduced guest texting to Hilton at Boca Raton, the first property to pilot what became a brand-wide platform</w:t>
       </w:r>
       <w:r>
         <w:rPr>

</xml_diff>

<commit_message>
Update resume: fix SafetyCulture ending, sync Beam section
SafetyCulture: replace "family comes first" with the Sydney/hard decision ending.
Beam: add LEED Platinum, 9,671 solar panels, 64% work order reduction, NPS +200%,
1,750+ unit renovations/$25M revenue, expense CAGR vs CPI context.
Updated docx and PDF.

Co-Authored-By: Claude Opus 4.6 (1M context) <noreply@anthropic.com>
</commit_message>
<xml_diff>
--- a/Kelly_Vohs_Resume.docx
+++ b/Kelly_Vohs_Resume.docx
@@ -27,47 +27,7 @@
           <w:sz w:val="18"/>
           <w:szCs w:val="18"/>
         </w:rPr>
-        <w:t xml:space="preserve">New York </w:t>
-      </w:r>
-      <w:proofErr w:type="gramStart"/>
-      <w:r>
-        <w:rPr>
-          <w:rFonts w:ascii="EB Garamond" w:eastAsia="EB Garamond" w:hAnsi="EB Garamond" w:cs="EB Garamond"/>
-          <w:color w:val="777777"/>
-          <w:sz w:val="18"/>
-          <w:szCs w:val="18"/>
-        </w:rPr>
-        <w:t>City  ·</w:t>
-      </w:r>
-      <w:proofErr w:type="gramEnd"/>
-      <w:r>
-        <w:rPr>
-          <w:rFonts w:ascii="EB Garamond" w:eastAsia="EB Garamond" w:hAnsi="EB Garamond" w:cs="EB Garamond"/>
-          <w:color w:val="777777"/>
-          <w:sz w:val="18"/>
-          <w:szCs w:val="18"/>
-        </w:rPr>
-        <w:t xml:space="preserve">  </w:t>
-      </w:r>
-      <w:proofErr w:type="gramStart"/>
-      <w:r>
-        <w:rPr>
-          <w:rFonts w:ascii="EB Garamond" w:eastAsia="EB Garamond" w:hAnsi="EB Garamond" w:cs="EB Garamond"/>
-          <w:color w:val="777777"/>
-          <w:sz w:val="18"/>
-          <w:szCs w:val="18"/>
-        </w:rPr>
-        <w:t>kelly@kellyvohs.com  ·</w:t>
-      </w:r>
-      <w:proofErr w:type="gramEnd"/>
-      <w:r>
-        <w:rPr>
-          <w:rFonts w:ascii="EB Garamond" w:eastAsia="EB Garamond" w:hAnsi="EB Garamond" w:cs="EB Garamond"/>
-          <w:color w:val="777777"/>
-          <w:sz w:val="18"/>
-          <w:szCs w:val="18"/>
-        </w:rPr>
-        <w:t xml:space="preserve">  +1 212 804 8575</w:t>
+        <w:t>New York City  ·  kelly@kellyvohs.com  ·  +1 212 804 8575</w:t>
       </w:r>
     </w:p>
     <w:p>
@@ -200,31 +160,7 @@
           <w:sz w:val="21"/>
           <w:szCs w:val="21"/>
         </w:rPr>
-        <w:t xml:space="preserve">CEO, </w:t>
-      </w:r>
-      <w:proofErr w:type="spellStart"/>
-      <w:r>
-        <w:rPr>
-          <w:rFonts w:ascii="EB Garamond" w:eastAsia="EB Garamond" w:hAnsi="EB Garamond" w:cs="EB Garamond"/>
-          <w:b/>
-          <w:bCs/>
-          <w:color w:val="000000"/>
-          <w:sz w:val="21"/>
-          <w:szCs w:val="21"/>
-        </w:rPr>
-        <w:t>SafetyCulture</w:t>
-      </w:r>
-      <w:proofErr w:type="spellEnd"/>
-      <w:r>
-        <w:rPr>
-          <w:rFonts w:ascii="EB Garamond" w:eastAsia="EB Garamond" w:hAnsi="EB Garamond" w:cs="EB Garamond"/>
-          <w:b/>
-          <w:bCs/>
-          <w:color w:val="000000"/>
-          <w:sz w:val="21"/>
-          <w:szCs w:val="21"/>
-        </w:rPr>
-        <w:t xml:space="preserve"> </w:t>
+        <w:t xml:space="preserve">CEO, SafetyCulture </w:t>
       </w:r>
       <w:r>
         <w:rPr>
@@ -248,20 +184,6 @@
         </w:rPr>
         <w:t xml:space="preserve">Global SaaS platform for frontline operations. 25,000 customers in 180+ countries, including IKEA, Royal Caribbean, Toyota, and SpaceX. Hired as President to lead go-to-market and customer strategy from the U.S. The founder stepped down two months before my start; I took over as CEO. Inherited a platform that needed a full rebuild and a team spread across Sydney, Manila, Manchester, Amsterdam, and Kansas City. Rebuilt the executive team. Attracted senior leaders from Google, Twitter, Okta, and Microsoft to Sydney. Reset the product roadmap and go-to-market motion, growing </w:t>
       </w:r>
-      <w:proofErr w:type="gramStart"/>
-      <w:r>
-        <w:rPr>
-          <w:rFonts w:ascii="EB Garamond" w:eastAsia="EB Garamond" w:hAnsi="EB Garamond" w:cs="EB Garamond"/>
-          <w:color w:val="555555"/>
-        </w:rPr>
-      </w:r>
-      <w:proofErr w:type="gramEnd"/>
-      <w:r>
-        <w:rPr>
-          <w:rFonts w:ascii="EB Garamond" w:eastAsia="EB Garamond" w:hAnsi="EB Garamond" w:cs="EB Garamond"/>
-          <w:color w:val="555555"/>
-        </w:rPr>
-      </w:r>
       <w:r>
         <w:rPr>
           <w:rFonts w:ascii="EB Garamond" w:eastAsia="EB Garamond" w:hAnsi="EB Garamond" w:cs="EB Garamond"/>
@@ -276,7 +198,7 @@
           <w:rFonts w:ascii="EB Garamond" w:eastAsia="EB Garamond" w:hAnsi="EB Garamond" w:cs="EB Garamond"/>
           <w:color w:val="555555"/>
         </w:rPr>
-        <w:t>. Stepped away when the role required permanent relocation to Sydney. Family comes first, a lesson the army taught me a long time ago.</w:t>
+        <w:t>. I flew to Sydney every month, but it became clear to me the team needed a CEO in Sydney, not New York. Hard decision, but the right one.</w:t>
       </w:r>
     </w:p>
     <w:p>
@@ -391,23 +313,7 @@
           <w:rFonts w:ascii="EB Garamond" w:eastAsia="EB Garamond" w:hAnsi="EB Garamond" w:cs="EB Garamond"/>
           <w:color w:val="555555"/>
         </w:rPr>
-        <w:t xml:space="preserve"> and executed </w:t>
-      </w:r>
-      <w:proofErr w:type="gramStart"/>
-      <w:r>
-        <w:rPr>
-          <w:rFonts w:ascii="EB Garamond" w:eastAsia="EB Garamond" w:hAnsi="EB Garamond" w:cs="EB Garamond"/>
-          <w:color w:val="555555"/>
-        </w:rPr>
-        <w:t>50K unit dispositions totaling $12B</w:t>
-      </w:r>
-      <w:proofErr w:type="gramEnd"/>
-      <w:r>
-        <w:rPr>
-          <w:rFonts w:ascii="EB Garamond" w:eastAsia="EB Garamond" w:hAnsi="EB Garamond" w:cs="EB Garamond"/>
-          <w:color w:val="555555"/>
-        </w:rPr>
-        <w:t>. Delivered $234M in ROI from 2020 to 2022 at an ~11% average return. Built the shared services model. Revenue management, technology, capital planning. Built Athena, an AI-enabled asset management platform, and the data infrastructure behind it, to drive decision-making across 500+ properties. Made sure local teams kept their autonomy and their voice.</w:t>
+        <w:t xml:space="preserve"> and executed 50K unit dispositions totaling $12B. Delivered $234M in ROI from 2020 to 2022 at an ~11% average return. Built the shared services model. Revenue management, technology, capital planning. Built Athena, an AI-enabled asset management platform, and the data infrastructure behind it, to drive decision-making across 500+ properties. Made sure local teams kept their autonomy and their voice.</w:t>
       </w:r>
     </w:p>
     <w:p>
@@ -789,18 +695,7 @@
           <w:sz w:val="21"/>
           <w:szCs w:val="21"/>
         </w:rPr>
-        <w:t xml:space="preserve"> </w:t>
-      </w:r>
-      <w:r>
-        <w:rPr>
-          <w:rFonts w:ascii="EB Garamond" w:eastAsia="EB Garamond" w:hAnsi="EB Garamond" w:cs="EB Garamond"/>
-          <w:b/>
-          <w:bCs/>
-          <w:color w:val="000000"/>
-          <w:sz w:val="21"/>
-          <w:szCs w:val="21"/>
-        </w:rPr>
-        <w:t xml:space="preserve">VP Operations, BR Guest Hospitality </w:t>
+        <w:t xml:space="preserve"> VP Operations, BR Guest Hospitality </w:t>
       </w:r>
       <w:r>
         <w:rPr>
@@ -941,23 +836,7 @@
           <w:rFonts w:ascii="EB Garamond" w:eastAsia="EB Garamond" w:hAnsi="EB Garamond" w:cs="EB Garamond"/>
           <w:color w:val="555555"/>
         </w:rPr>
-        <w:t xml:space="preserve">. Led humanitarian relief operations in Tajikistan. landed U.S. aircraft on a remote airfield 48 hours after meeting with the Deputy Prime Minister, </w:t>
-      </w:r>
-      <w:proofErr w:type="gramStart"/>
-      <w:r>
-        <w:rPr>
-          <w:rFonts w:ascii="EB Garamond" w:eastAsia="EB Garamond" w:hAnsi="EB Garamond" w:cs="EB Garamond"/>
-          <w:color w:val="555555"/>
-        </w:rPr>
-        <w:t>assisted</w:t>
-      </w:r>
-      <w:proofErr w:type="gramEnd"/>
-      <w:r>
-        <w:rPr>
-          <w:rFonts w:ascii="EB Garamond" w:eastAsia="EB Garamond" w:hAnsi="EB Garamond" w:cs="EB Garamond"/>
-          <w:color w:val="555555"/>
-        </w:rPr>
-        <w:t xml:space="preserve"> </w:t>
+        <w:t xml:space="preserve">. Led humanitarian relief operations in Tajikistan. landed U.S. aircraft on a remote airfield 48 hours after meeting with the Deputy Prime Minister, assisted </w:t>
       </w:r>
       <w:r>
         <w:rPr>
@@ -1035,23 +914,7 @@
           <w:rFonts w:ascii="EB Garamond" w:eastAsia="EB Garamond" w:hAnsi="EB Garamond" w:cs="EB Garamond"/>
           <w:color w:val="555555"/>
         </w:rPr>
-        <w:t xml:space="preserve"> started. In that order. Built </w:t>
-      </w:r>
-      <w:proofErr w:type="spellStart"/>
-      <w:r>
-        <w:rPr>
-          <w:rFonts w:ascii="EB Garamond" w:eastAsia="EB Garamond" w:hAnsi="EB Garamond" w:cs="EB Garamond"/>
-          <w:color w:val="555555"/>
-        </w:rPr>
-        <w:t>L’Escalier</w:t>
-      </w:r>
-      <w:proofErr w:type="spellEnd"/>
-      <w:r>
-        <w:rPr>
-          <w:rFonts w:ascii="EB Garamond" w:eastAsia="EB Garamond" w:hAnsi="EB Garamond" w:cs="EB Garamond"/>
-          <w:color w:val="555555"/>
-        </w:rPr>
-        <w:t xml:space="preserve"> restaurant from the ground up and won the </w:t>
+        <w:t xml:space="preserve"> started. In that order. Built L’Escalier restaurant from the ground up and won the </w:t>
       </w:r>
       <w:r>
         <w:rPr>

</xml_diff>